<commit_message>
Improve diagram sizing in SRS document for better readability
- Resized all diagrams to fit properly on pages
- Use Case Diagram: 5.0 inches width
- ERD: 5.5 inches width
- Activity Diagram: 4.5 inches width
- Sequence Diagrams: 5.5 inches width
- Each diagram now fits within page boundaries
- Added page breaks between diagrams for better layout
- Improved visual clarity and readability
</commit_message>
<xml_diff>
--- a/analysis/SRS_Document_With_Diagrams.docx
+++ b/analysis/SRS_Document_With_Diagrams.docx
@@ -694,7 +694,7 @@
     </w:p>
     <w:p>
       <w:r>
-        <w:t>This section provides a visual overview of the system architecture through a series of UML diagrams. All diagrams follow UML 2.5 standards and are rendered at high resolution (300 DPI) for clarity.</w:t>
+        <w:t>This section provides a visual overview of the system architecture through a series of UML diagrams. All diagrams follow UML 2.5 standards and are rendered at high resolution for clarity.</w:t>
       </w:r>
     </w:p>
     <w:p>
@@ -710,6 +710,7 @@
         <w:t>The Use Case Diagram illustrates the interactions between system actors (Administrator, Proctor, Student, and ML Service) and the main use cases of the Exam Security System. It shows the functional scope of the system from the users' perspective.</w:t>
       </w:r>
     </w:p>
+    <w:p/>
     <w:p>
       <w:pPr>
         <w:jc w:val="center"/>
@@ -717,7 +718,7 @@
       <w:r>
         <w:drawing>
           <wp:inline xmlns:a="http://schemas.openxmlformats.org/drawingml/2006/main" xmlns:pic="http://schemas.openxmlformats.org/drawingml/2006/picture">
-            <wp:extent cx="5943600" cy="14043660"/>
+            <wp:extent cx="4572000" cy="10802815"/>
             <wp:docPr id="1" name="Picture 1"/>
             <wp:cNvGraphicFramePr>
               <a:graphicFrameLocks noChangeAspect="1"/>
@@ -738,7 +739,7 @@
                   <pic:spPr>
                     <a:xfrm>
                       <a:off x="0" y="0"/>
-                      <a:ext cx="5943600" cy="14043660"/>
+                      <a:ext cx="4572000" cy="10802815"/>
                     </a:xfrm>
                     <a:prstGeom prst="rect"/>
                   </pic:spPr>
@@ -756,12 +757,18 @@
       <w:r>
         <w:rPr>
           <w:i/>
+          <w:sz w:val="20"/>
         </w:rPr>
         <w:t>Figure 1: Use Case Diagram</w:t>
       </w:r>
     </w:p>
     <w:p/>
     <w:p>
+      <w:r>
+        <w:br w:type="page"/>
+      </w:r>
+    </w:p>
+    <w:p>
       <w:pPr>
         <w:pStyle w:val="Heading2"/>
       </w:pPr>
@@ -774,6 +781,7 @@
         <w:t>The Entity Relationship Diagram shows the complete database schema, including all entities (tables), their attributes, and the relationships between them. It uses Crow's Foot notation to represent cardinality. The diagram includes 9 main tables: users, rooms, exams, students, exam_rosters, seating_plans, seat_assignments, check_ins, violations, and audit_logs.</w:t>
       </w:r>
     </w:p>
+    <w:p/>
     <w:p>
       <w:pPr>
         <w:jc w:val="center"/>
@@ -781,7 +789,7 @@
       <w:r>
         <w:drawing>
           <wp:inline xmlns:a="http://schemas.openxmlformats.org/drawingml/2006/main" xmlns:pic="http://schemas.openxmlformats.org/drawingml/2006/picture">
-            <wp:extent cx="5943600" cy="4160520"/>
+            <wp:extent cx="5029200" cy="3520440"/>
             <wp:docPr id="2" name="Picture 2"/>
             <wp:cNvGraphicFramePr>
               <a:graphicFrameLocks noChangeAspect="1"/>
@@ -802,7 +810,7 @@
                   <pic:spPr>
                     <a:xfrm>
                       <a:off x="0" y="0"/>
-                      <a:ext cx="5943600" cy="4160520"/>
+                      <a:ext cx="5029200" cy="3520440"/>
                     </a:xfrm>
                     <a:prstGeom prst="rect"/>
                   </pic:spPr>
@@ -820,12 +828,18 @@
       <w:r>
         <w:rPr>
           <w:i/>
+          <w:sz w:val="20"/>
         </w:rPr>
         <w:t>Figure 2: Entity Relationship Diagram (ERD)</w:t>
       </w:r>
     </w:p>
     <w:p/>
     <w:p>
+      <w:r>
+        <w:br w:type="page"/>
+      </w:r>
+    </w:p>
+    <w:p>
       <w:pPr>
         <w:pStyle w:val="Heading2"/>
       </w:pPr>
@@ -838,6 +852,7 @@
         <w:t>The Activity Diagram provides a high-level overview of the exam day workflow, showing the flow of activities between the Administrator, Proctor, and the System. It illustrates the complete process from exam setup to report generation.</w:t>
       </w:r>
     </w:p>
+    <w:p/>
     <w:p>
       <w:pPr>
         <w:jc w:val="center"/>
@@ -845,7 +860,7 @@
       <w:r>
         <w:drawing>
           <wp:inline xmlns:a="http://schemas.openxmlformats.org/drawingml/2006/main" xmlns:pic="http://schemas.openxmlformats.org/drawingml/2006/picture">
-            <wp:extent cx="5943600" cy="15895320"/>
+            <wp:extent cx="4114800" cy="11004452"/>
             <wp:docPr id="3" name="Picture 3"/>
             <wp:cNvGraphicFramePr>
               <a:graphicFrameLocks noChangeAspect="1"/>
@@ -866,7 +881,7 @@
                   <pic:spPr>
                     <a:xfrm>
                       <a:off x="0" y="0"/>
-                      <a:ext cx="5943600" cy="15895320"/>
+                      <a:ext cx="4114800" cy="11004452"/>
                     </a:xfrm>
                     <a:prstGeom prst="rect"/>
                   </pic:spPr>
@@ -884,6 +899,7 @@
       <w:r>
         <w:rPr>
           <w:i/>
+          <w:sz w:val="20"/>
         </w:rPr>
         <w:t>Figure 3: Activity Diagram (Exam Day Workflow)</w:t>
       </w:r>
@@ -903,6 +919,11 @@
       </w:r>
     </w:p>
     <w:p>
+      <w:r>
+        <w:t>The following sequence diagrams detail the step-by-step interactions for key system workflows.</w:t>
+      </w:r>
+    </w:p>
+    <w:p>
       <w:pPr>
         <w:pStyle w:val="Heading3"/>
       </w:pPr>
@@ -915,6 +936,7 @@
         <w:t>This sequence diagram details the step-by-step interactions for the student check-in process, including identity verification using ML/CV, seat compliance checking, and automatic violation creation. It shows the communication between the Proctor, Web Interface, Backend Server, ML Service, Database, and File Storage components.</w:t>
       </w:r>
     </w:p>
+    <w:p/>
     <w:p>
       <w:pPr>
         <w:jc w:val="center"/>
@@ -922,7 +944,7 @@
       <w:r>
         <w:drawing>
           <wp:inline xmlns:a="http://schemas.openxmlformats.org/drawingml/2006/main" xmlns:pic="http://schemas.openxmlformats.org/drawingml/2006/picture">
-            <wp:extent cx="5943600" cy="16078200"/>
+            <wp:extent cx="5029200" cy="13604631"/>
             <wp:docPr id="4" name="Picture 4"/>
             <wp:cNvGraphicFramePr>
               <a:graphicFrameLocks noChangeAspect="1"/>
@@ -943,7 +965,7 @@
                   <pic:spPr>
                     <a:xfrm>
                       <a:off x="0" y="0"/>
-                      <a:ext cx="5943600" cy="16078200"/>
+                      <a:ext cx="5029200" cy="13604631"/>
                     </a:xfrm>
                     <a:prstGeom prst="rect"/>
                   </pic:spPr>
@@ -961,12 +983,18 @@
       <w:r>
         <w:rPr>
           <w:i/>
+          <w:sz w:val="20"/>
         </w:rPr>
         <w:t>Figure 4: Sequence Diagram - Student Check-In Workflow</w:t>
       </w:r>
     </w:p>
     <w:p/>
     <w:p>
+      <w:r>
+        <w:br w:type="page"/>
+      </w:r>
+    </w:p>
+    <w:p>
       <w:pPr>
         <w:pStyle w:val="Heading3"/>
       </w:pPr>
@@ -979,6 +1007,7 @@
         <w:t>This sequence diagram shows the workflow for a proctor recording an exam violation with optional evidence attachment. It includes violation type selection, severity assignment, and audit logging.</w:t>
       </w:r>
     </w:p>
+    <w:p/>
     <w:p>
       <w:pPr>
         <w:jc w:val="center"/>
@@ -986,7 +1015,7 @@
       <w:r>
         <w:drawing>
           <wp:inline xmlns:a="http://schemas.openxmlformats.org/drawingml/2006/main" xmlns:pic="http://schemas.openxmlformats.org/drawingml/2006/picture">
-            <wp:extent cx="5943600" cy="6377940"/>
+            <wp:extent cx="5029200" cy="5396718"/>
             <wp:docPr id="5" name="Picture 5"/>
             <wp:cNvGraphicFramePr>
               <a:graphicFrameLocks noChangeAspect="1"/>
@@ -1007,7 +1036,7 @@
                   <pic:spPr>
                     <a:xfrm>
                       <a:off x="0" y="0"/>
-                      <a:ext cx="5943600" cy="6377940"/>
+                      <a:ext cx="5029200" cy="5396718"/>
                     </a:xfrm>
                     <a:prstGeom prst="rect"/>
                   </pic:spPr>
@@ -1025,12 +1054,18 @@
       <w:r>
         <w:rPr>
           <w:i/>
+          <w:sz w:val="20"/>
         </w:rPr>
         <w:t>Figure 5: Sequence Diagram - Violation Recording Workflow</w:t>
       </w:r>
     </w:p>
     <w:p/>
     <w:p>
+      <w:r>
+        <w:br w:type="page"/>
+      </w:r>
+    </w:p>
+    <w:p>
       <w:pPr>
         <w:pStyle w:val="Heading3"/>
       </w:pPr>
@@ -1043,6 +1078,7 @@
         <w:t>This sequence diagram illustrates the process of an administrator generating and exporting exam reports. It shows the interaction with the Report Generator Service and the various export options (CSV, PDF).</w:t>
       </w:r>
     </w:p>
+    <w:p/>
     <w:p>
       <w:pPr>
         <w:jc w:val="center"/>
@@ -1050,7 +1086,7 @@
       <w:r>
         <w:drawing>
           <wp:inline xmlns:a="http://schemas.openxmlformats.org/drawingml/2006/main" xmlns:pic="http://schemas.openxmlformats.org/drawingml/2006/picture">
-            <wp:extent cx="5943600" cy="9806940"/>
+            <wp:extent cx="5029200" cy="8298180"/>
             <wp:docPr id="6" name="Picture 6"/>
             <wp:cNvGraphicFramePr>
               <a:graphicFrameLocks noChangeAspect="1"/>
@@ -1071,7 +1107,7 @@
                   <pic:spPr>
                     <a:xfrm>
                       <a:off x="0" y="0"/>
-                      <a:ext cx="5943600" cy="9806940"/>
+                      <a:ext cx="5029200" cy="8298180"/>
                     </a:xfrm>
                     <a:prstGeom prst="rect"/>
                   </pic:spPr>
@@ -1089,6 +1125,7 @@
       <w:r>
         <w:rPr>
           <w:i/>
+          <w:sz w:val="20"/>
         </w:rPr>
         <w:t>Figure 6: Sequence Diagram - Report Generation Workflow</w:t>
       </w:r>

</xml_diff>